<commit_message>
Remove signature section from partner agreement documents
- Update Word document: remove signature page, add terms of use section
- Regenerate PDF without signatures
- Implied acceptance via platform usage (no signatures needed)

Files updated:
- public/legal/BespoxAI_Partner_Agreement_Signable.docx
- public/legal/BespoxAI_Partner_Agreement_Signable.pdf
</commit_message>
<xml_diff>
--- a/public/legal/BespoxAI_Partner_Agreement_Signable.docx
+++ b/public/legal/BespoxAI_Partner_Agreement_Signable.docx
@@ -425,7 +425,7 @@
     </w:p>
     <w:p>
       <w:pPr>
-        <w:spacing w:after="240" w:before="240"/>
+        <w:spacing w:after="40" w:before="240"/>
       </w:pPr>
       <w:r>
         <w:t xml:space="preserve"/>
@@ -433,33 +433,23 @@
     </w:p>
     <w:p>
       <w:pPr>
-        <w:spacing w:after="240"/>
-        <w:jc w:val="center"/>
-      </w:pPr>
-      <w:r>
-        <w:t xml:space="preserve">---</w:t>
-      </w:r>
-    </w:p>
-    <w:p>
-      <w:pPr>
-        <w:pStyle w:val="Heading1"/>
-        <w:spacing w:after="200" w:before="240"/>
-      </w:pPr>
-      <w:r>
-        <w:t xml:space="preserve">SIGNATURE PAGE</w:t>
-      </w:r>
-    </w:p>
-    <w:p>
-      <w:pPr>
-        <w:spacing w:after="200"/>
-      </w:pPr>
-      <w:r>
-        <w:t xml:space="preserve">By signing below, the parties acknowledge they have read, understood, and agree to be bound by this Agreement.</w:t>
-      </w:r>
-    </w:p>
-    <w:p>
-      <w:pPr>
-        <w:spacing w:after="120"/>
+        <w:pStyle w:val="Heading2"/>
+      </w:pPr>
+      <w:r>
+        <w:t xml:space="preserve">TERMS OF USE</w:t>
+      </w:r>
+    </w:p>
+    <w:p>
+      <w:pPr>
+        <w:spacing w:after="120" w:line="360"/>
+      </w:pPr>
+      <w:r>
+        <w:t xml:space="preserve">By creating a partner account and using the BespoxAI Partner Portal, you agree to be bound by this Agreement. No signature or printed acknowledgment is required—your continued use of the platform constitutes acceptance of these terms and conditions.</w:t>
+      </w:r>
+    </w:p>
+    <w:p>
+      <w:pPr>
+        <w:spacing w:before="200"/>
       </w:pPr>
       <w:r>
         <w:t xml:space="preserve"/>
@@ -467,143 +457,10 @@
     </w:p>
     <w:p>
       <w:pPr>
-        <w:pStyle w:val="Heading2"/>
-      </w:pPr>
-      <w:r>
-        <w:t xml:space="preserve">FOR BESPOXAI:</w:t>
-      </w:r>
-    </w:p>
-    <w:p>
-      <w:pPr>
-        <w:spacing w:after="200"/>
-      </w:pPr>
-      <w:r>
-        <w:t xml:space="preserve"/>
-      </w:r>
-    </w:p>
-    <w:p>
-      <w:pPr>
-        <w:spacing w:after="80"/>
-      </w:pPr>
-      <w:r>
-        <w:t xml:space="preserve">Authorized Representative: ________________________________________________</w:t>
-      </w:r>
-    </w:p>
-    <w:p>
-      <w:pPr>
-        <w:spacing w:after="80"/>
-      </w:pPr>
-      <w:r>
-        <w:t xml:space="preserve">Name (print): ________________________________________________</w:t>
-      </w:r>
-    </w:p>
-    <w:p>
-      <w:pPr>
-        <w:spacing w:after="80"/>
-      </w:pPr>
-      <w:r>
-        <w:t xml:space="preserve">Title: ________________________________________________</w:t>
-      </w:r>
-    </w:p>
-    <w:p>
-      <w:pPr>
-        <w:spacing w:after="240"/>
-      </w:pPr>
-      <w:r>
-        <w:t xml:space="preserve">Date: ________________________________________________</w:t>
-      </w:r>
-    </w:p>
-    <w:p>
-      <w:pPr>
-        <w:spacing w:after="200"/>
-      </w:pPr>
-      <w:r>
-        <w:t xml:space="preserve"/>
-      </w:r>
-    </w:p>
-    <w:p>
-      <w:pPr>
-        <w:pStyle w:val="Heading2"/>
-      </w:pPr>
-      <w:r>
-        <w:t xml:space="preserve">FOR PARTNER:</w:t>
-      </w:r>
-    </w:p>
-    <w:p>
-      <w:pPr>
-        <w:spacing w:after="200"/>
-      </w:pPr>
-      <w:r>
-        <w:t xml:space="preserve"/>
-      </w:r>
-    </w:p>
-    <w:p>
-      <w:pPr>
-        <w:spacing w:after="80"/>
-      </w:pPr>
-      <w:r>
-        <w:t xml:space="preserve">Authorized Representative: ________________________________________________</w:t>
-      </w:r>
-    </w:p>
-    <w:p>
-      <w:pPr>
-        <w:spacing w:after="80"/>
-      </w:pPr>
-      <w:r>
-        <w:t xml:space="preserve">Name (print): ________________________________________________</w:t>
-      </w:r>
-    </w:p>
-    <w:p>
-      <w:pPr>
-        <w:spacing w:after="80"/>
-      </w:pPr>
-      <w:r>
-        <w:t xml:space="preserve">Title: ________________________________________________</w:t>
-      </w:r>
-    </w:p>
-    <w:p>
-      <w:pPr>
-        <w:spacing w:after="240"/>
-      </w:pPr>
-      <w:r>
-        <w:t xml:space="preserve">Date: ________________________________________________</w:t>
-      </w:r>
-    </w:p>
-    <w:p>
-      <w:pPr>
-        <w:spacing w:after="400"/>
-      </w:pPr>
-      <w:r>
-        <w:t xml:space="preserve"/>
-      </w:r>
-    </w:p>
-    <w:p>
-      <w:pPr>
-        <w:pStyle w:val="Heading2"/>
-      </w:pPr>
-      <w:r>
-        <w:t xml:space="preserve">NOTES</w:t>
-      </w:r>
-    </w:p>
-    <w:p>
-      <w:pPr>
-        <w:spacing w:after="120"/>
-      </w:pPr>
-      <w:r>
-        <w:t xml:space="preserve">This document is a template. Full agreement text (all 15+ sections) is included in the accompanying markdown file.</w:t>
-      </w:r>
-    </w:p>
-    <w:p>
-      <w:pPr>
-        <w:spacing w:after="120"/>
-      </w:pPr>
-      <w:r>
-        <w:t xml:space="preserve">Complete all bracketed fields [LIKE THIS] and all Schedules A–E before execution.</w:t>
-      </w:r>
-    </w:p>
-    <w:p>
-      <w:r>
-        <w:t xml:space="preserve">Have a qualified NZ/AU legal advisor review before signature.</w:t>
+        <w:spacing w:line="360"/>
+      </w:pPr>
+      <w:r>
+        <w:t xml:space="preserve">Complete Agreement — Download the full PDF or markdown template at /partners/resources/agreement</w:t>
       </w:r>
     </w:p>
     <w:sectPr>

</xml_diff>

<commit_message>
Add blanket security breach and data loss liability exclusion
Section 11.4: Complete liability exclusion for BCAgent and service-related:
- Security breaches and unauthorized access (regardless of cause)
- Data loss, corruption, or destruction while using platform/BCAgent
- Ransomware, malware, cyberattacks on partner systems
- Credential compromise or weak security practices
- Business interruption or regulatory fines from partner security failures

Partner assumes all security and data protection risk for:
- BCAgent installation security
- Credential management
- Network security controls
- Data backup and recovery
- Breach notification

Applies to all partner-facing systems accessed via the service.

Files updated:
- public/legal/BespoxAI_Partner_Agreement_Signable.pdf
- public/legal/BespoxAI_Partner_Agreement_Signable.docx
- /mnt/user-data/outputs/BespoxAI_Partner_Agreement_Template.md
</commit_message>
<xml_diff>
--- a/public/legal/BespoxAI_Partner_Agreement_Signable.docx
+++ b/public/legal/BespoxAI_Partner_Agreement_Signable.docx
@@ -425,7 +425,115 @@
     </w:p>
     <w:p>
       <w:pPr>
-        <w:spacing w:after="40" w:before="240"/>
+        <w:spacing w:after="20" w:before="200"/>
+      </w:pPr>
+      <w:r>
+        <w:t xml:space="preserve"/>
+      </w:r>
+    </w:p>
+    <w:p>
+      <w:pPr>
+        <w:pStyle w:val="Heading2"/>
+      </w:pPr>
+      <w:r>
+        <w:t xml:space="preserve">11. LIMITATIONS OF LIABILITY</w:t>
+      </w:r>
+    </w:p>
+    <w:p>
+      <w:pPr>
+        <w:pStyle w:val="Heading2"/>
+      </w:pPr>
+      <w:r>
+        <w:t xml:space="preserve">11.1 Cap on Liability</w:t>
+      </w:r>
+    </w:p>
+    <w:p>
+      <w:pPr>
+        <w:spacing w:after="120" w:line="360"/>
+      </w:pPr>
+      <w:r>
+        <w:t xml:space="preserve">Except for indemnification obligations, breaches of confidentiality, or claims arising from IP infringement: BespoxAI's total liability shall not exceed the fees paid by Partner in the 12 months preceding the claim.</w:t>
+      </w:r>
+    </w:p>
+    <w:p>
+      <w:pPr>
+        <w:pStyle w:val="Heading2"/>
+      </w:pPr>
+      <w:r>
+        <w:t xml:space="preserve">11.4 Security Breaches and Data Loss – Complete Exclusion</w:t>
+      </w:r>
+    </w:p>
+    <w:p>
+      <w:pPr>
+        <w:spacing w:after="120" w:line="360"/>
+      </w:pPr>
+      <w:r>
+        <w:t xml:space="preserve">Notwithstanding any other provision in this Agreement, BespoxAI shall have NO LIABILITY whatsoever for:</w:t>
+      </w:r>
+    </w:p>
+    <w:p>
+      <w:pPr>
+        <w:spacing w:after="80" w:line="360"/>
+      </w:pPr>
+      <w:r>
+        <w:t xml:space="preserve">• Any security breach, unauthorized access, or compromised credentials involving the Platform, BCAgent, or any partner-facing systems accessed via the service, regardless of cause or origin;</w:t>
+      </w:r>
+    </w:p>
+    <w:p>
+      <w:pPr>
+        <w:spacing w:after="80" w:line="360"/>
+      </w:pPr>
+      <w:r>
+        <w:t xml:space="preserve">• Any loss, corruption, destruction, or inaccessibility of data while using BCAgent, the Platform, or related services;</w:t>
+      </w:r>
+    </w:p>
+    <w:p>
+      <w:pPr>
+        <w:spacing w:after="80" w:line="360"/>
+      </w:pPr>
+      <w:r>
+        <w:t xml:space="preserve">• Ransomware attacks, malware infections, or cyberattacks affecting Partner's systems or Business Central/NAV databases;</w:t>
+      </w:r>
+    </w:p>
+    <w:p>
+      <w:pPr>
+        <w:spacing w:after="80" w:line="360"/>
+      </w:pPr>
+      <w:r>
+        <w:t xml:space="preserve">• Data exfiltration or destruction due to compromised credentials or weak security practices;</w:t>
+      </w:r>
+    </w:p>
+    <w:p>
+      <w:pPr>
+        <w:spacing w:after="120" w:line="360"/>
+      </w:pPr>
+      <w:r>
+        <w:t xml:space="preserve">• Business interruption or regulatory fines arising from Partner's data security practices.</w:t>
+      </w:r>
+    </w:p>
+    <w:p>
+      <w:pPr>
+        <w:spacing w:after="80"/>
+      </w:pPr>
+      <w:r>
+        <w:rPr>
+          <w:b/>
+          <w:bCs/>
+        </w:rPr>
+        <w:t xml:space="preserve">Partner's Responsibility: </w:t>
+      </w:r>
+    </w:p>
+    <w:p>
+      <w:pPr>
+        <w:spacing w:after="120" w:line="360"/>
+      </w:pPr>
+      <w:r>
+        <w:t xml:space="preserve">Partner is solely responsible for securing BCAgent installations, managing credentials, implementing network security controls, maintaining backups, and notifying BespoxAI immediately of any suspected breach.</w:t>
+      </w:r>
+    </w:p>
+    <w:p>
+      <w:pPr>
+        <w:spacing w:after="40" w:before="200"/>
       </w:pPr>
       <w:r>
         <w:t xml:space="preserve"/>

</xml_diff>